<commit_message>
Update Errata_5. Dark Light v4.docx
</commit_message>
<xml_diff>
--- a/Working Folder/5 Lee Ji Heng 李智恒 - Dark Light 黑光/Errata_5. Dark Light v4.docx
+++ b/Working Folder/5 Lee Ji Heng 李智恒 - Dark Light 黑光/Errata_5. Dark Light v4.docx
@@ -1,6 +1,6 @@
 
 <file path=word/document.xml><?xml version="1.0" encoding="utf-8"?>
-<w:document xmlns:wpc="http://schemas.microsoft.com/office/word/2010/wordprocessingCanvas" xmlns:cx="http://schemas.microsoft.com/office/drawing/2014/chartex" xmlns:cx1="http://schemas.microsoft.com/office/drawing/2015/9/8/chartex" xmlns:cx2="http://schemas.microsoft.com/office/drawing/2015/10/21/chartex" xmlns:cx3="http://schemas.microsoft.com/office/drawing/2016/5/9/chartex" xmlns:cx4="http://schemas.microsoft.com/office/drawing/2016/5/10/chartex" xmlns:cx5="http://schemas.microsoft.com/office/drawing/2016/5/11/chartex" xmlns:cx6="http://schemas.microsoft.com/office/drawing/2016/5/12/chartex" xmlns:cx7="http://schemas.microsoft.com/office/drawing/2016/5/13/chartex" xmlns:cx8="http://schemas.microsoft.com/office/drawing/2016/5/14/chartex" xmlns:mc="http://schemas.openxmlformats.org/markup-compatibility/2006" xmlns:aink="http://schemas.microsoft.com/office/drawing/2016/ink" xmlns:am3d="http://schemas.microsoft.com/office/drawing/2017/model3d" xmlns:o="urn:schemas-microsoft-com:office:office" xmlns:r="http://schemas.openxmlformats.org/officeDocument/2006/relationships" xmlns:m="http://schemas.openxmlformats.org/officeDocument/2006/math" xmlns:v="urn:schemas-microsoft-com:vml" xmlns:wp14="http://schemas.microsoft.com/office/word/2010/wordprocessingDrawing" xmlns:wp="http://schemas.openxmlformats.org/drawingml/2006/wordprocessingDrawing" xmlns:w10="urn:schemas-microsoft-com:office:word" xmlns:w="http://schemas.openxmlformats.org/wordprocessingml/2006/main" xmlns:w14="http://schemas.microsoft.com/office/word/2010/wordml" xmlns:w15="http://schemas.microsoft.com/office/word/2012/wordml" xmlns:w16cid="http://schemas.microsoft.com/office/word/2016/wordml/cid" xmlns:w16se="http://schemas.microsoft.com/office/word/2015/wordml/symex" xmlns:wpg="http://schemas.microsoft.com/office/word/2010/wordprocessingGroup" xmlns:wpi="http://schemas.microsoft.com/office/word/2010/wordprocessingInk" xmlns:wne="http://schemas.microsoft.com/office/word/2006/wordml" xmlns:wps="http://schemas.microsoft.com/office/word/2010/wordprocessingShape" mc:Ignorable="w14 w15 w16se w16cid wp14">
+<w:document xmlns:wpc="http://schemas.microsoft.com/office/word/2010/wordprocessingCanvas" xmlns:cx="http://schemas.microsoft.com/office/drawing/2014/chartex" xmlns:cx1="http://schemas.microsoft.com/office/drawing/2015/9/8/chartex" xmlns:cx2="http://schemas.microsoft.com/office/drawing/2015/10/21/chartex" xmlns:cx3="http://schemas.microsoft.com/office/drawing/2016/5/9/chartex" xmlns:cx4="http://schemas.microsoft.com/office/drawing/2016/5/10/chartex" xmlns:cx5="http://schemas.microsoft.com/office/drawing/2016/5/11/chartex" xmlns:cx6="http://schemas.microsoft.com/office/drawing/2016/5/12/chartex" xmlns:cx7="http://schemas.microsoft.com/office/drawing/2016/5/13/chartex" xmlns:cx8="http://schemas.microsoft.com/office/drawing/2016/5/14/chartex" xmlns:mc="http://schemas.openxmlformats.org/markup-compatibility/2006" xmlns:aink="http://schemas.microsoft.com/office/drawing/2016/ink" xmlns:am3d="http://schemas.microsoft.com/office/drawing/2017/model3d" xmlns:o="urn:schemas-microsoft-com:office:office" xmlns:oel="http://schemas.microsoft.com/office/2019/extlst" xmlns:r="http://schemas.openxmlformats.org/officeDocument/2006/relationships" xmlns:m="http://schemas.openxmlformats.org/officeDocument/2006/math" xmlns:v="urn:schemas-microsoft-com:vml" xmlns:wp14="http://schemas.microsoft.com/office/word/2010/wordprocessingDrawing" xmlns:wp="http://schemas.openxmlformats.org/drawingml/2006/wordprocessingDrawing" xmlns:w10="urn:schemas-microsoft-com:office:word" xmlns:w="http://schemas.openxmlformats.org/wordprocessingml/2006/main" xmlns:w14="http://schemas.microsoft.com/office/word/2010/wordml" xmlns:w15="http://schemas.microsoft.com/office/word/2012/wordml" xmlns:w16cex="http://schemas.microsoft.com/office/word/2018/wordml/cex" xmlns:w16cid="http://schemas.microsoft.com/office/word/2016/wordml/cid" xmlns:w16="http://schemas.microsoft.com/office/word/2018/wordml" xmlns:w16du="http://schemas.microsoft.com/office/word/2023/wordml/word16du" xmlns:w16sdtdh="http://schemas.microsoft.com/office/word/2020/wordml/sdtdatahash" xmlns:w16se="http://schemas.microsoft.com/office/word/2015/wordml/symex" xmlns:wpg="http://schemas.microsoft.com/office/word/2010/wordprocessingGroup" xmlns:wpi="http://schemas.microsoft.com/office/word/2010/wordprocessingInk" xmlns:wne="http://schemas.microsoft.com/office/word/2006/wordml" xmlns:wps="http://schemas.microsoft.com/office/word/2010/wordprocessingShape" mc:Ignorable="w14 w15 w16se w16cid w16 w16cex w16sdtdh w16du wp14">
   <w:body>
     <w:p>
       <w:pPr>
@@ -219,14 +219,12 @@
               <w:pStyle w:val="TableParagraph"/>
               <w:ind w:left="118" w:right="131" w:hanging="1"/>
             </w:pPr>
-            <w:proofErr w:type="spellStart"/>
             <w:r>
               <w:rPr>
                 <w:spacing w:val="-2"/>
               </w:rPr>
               <w:t>Reh</w:t>
             </w:r>
-            <w:proofErr w:type="spellEnd"/>
             <w:r>
               <w:rPr>
                 <w:spacing w:val="-2"/>
@@ -2263,8 +2261,14 @@
           <w:sz w:val="20"/>
         </w:rPr>
       </w:pPr>
-      <w:bookmarkStart w:id="0" w:name="_GoBack"/>
-      <w:bookmarkEnd w:id="0"/>
+      <w:r>
+        <w:rPr>
+          <w:rFonts w:ascii="Palatino Linotype" w:hint="cs"/>
+          <w:i/>
+          <w:sz w:val="20"/>
+        </w:rPr>
+        <w:t>5 Dark Light the composer said to change all the triangle noteheads for percussion to normal noteheads.</w:t>
+      </w:r>
     </w:p>
     <w:sectPr>
       <w:headerReference w:type="default" r:id="rId6"/>
@@ -2279,7 +2283,7 @@
 </file>
 
 <file path=word/endnotes.xml><?xml version="1.0" encoding="utf-8"?>
-<w:endnotes xmlns:wpc="http://schemas.microsoft.com/office/word/2010/wordprocessingCanvas" xmlns:cx="http://schemas.microsoft.com/office/drawing/2014/chartex" xmlns:cx1="http://schemas.microsoft.com/office/drawing/2015/9/8/chartex" xmlns:cx2="http://schemas.microsoft.com/office/drawing/2015/10/21/chartex" xmlns:cx3="http://schemas.microsoft.com/office/drawing/2016/5/9/chartex" xmlns:cx4="http://schemas.microsoft.com/office/drawing/2016/5/10/chartex" xmlns:cx5="http://schemas.microsoft.com/office/drawing/2016/5/11/chartex" xmlns:cx6="http://schemas.microsoft.com/office/drawing/2016/5/12/chartex" xmlns:cx7="http://schemas.microsoft.com/office/drawing/2016/5/13/chartex" xmlns:cx8="http://schemas.microsoft.com/office/drawing/2016/5/14/chartex" xmlns:mc="http://schemas.openxmlformats.org/markup-compatibility/2006" xmlns:aink="http://schemas.microsoft.com/office/drawing/2016/ink" xmlns:am3d="http://schemas.microsoft.com/office/drawing/2017/model3d" xmlns:o="urn:schemas-microsoft-com:office:office" xmlns:r="http://schemas.openxmlformats.org/officeDocument/2006/relationships" xmlns:m="http://schemas.openxmlformats.org/officeDocument/2006/math" xmlns:v="urn:schemas-microsoft-com:vml" xmlns:wp14="http://schemas.microsoft.com/office/word/2010/wordprocessingDrawing" xmlns:wp="http://schemas.openxmlformats.org/drawingml/2006/wordprocessingDrawing" xmlns:w10="urn:schemas-microsoft-com:office:word" xmlns:w="http://schemas.openxmlformats.org/wordprocessingml/2006/main" xmlns:w14="http://schemas.microsoft.com/office/word/2010/wordml" xmlns:w15="http://schemas.microsoft.com/office/word/2012/wordml" xmlns:w16cid="http://schemas.microsoft.com/office/word/2016/wordml/cid" xmlns:w16se="http://schemas.microsoft.com/office/word/2015/wordml/symex" xmlns:wpg="http://schemas.microsoft.com/office/word/2010/wordprocessingGroup" xmlns:wpi="http://schemas.microsoft.com/office/word/2010/wordprocessingInk" xmlns:wne="http://schemas.microsoft.com/office/word/2006/wordml" xmlns:wps="http://schemas.microsoft.com/office/word/2010/wordprocessingShape" mc:Ignorable="w14 w15 w16se w16cid wp14">
+<w:endnotes xmlns:wpc="http://schemas.microsoft.com/office/word/2010/wordprocessingCanvas" xmlns:cx="http://schemas.microsoft.com/office/drawing/2014/chartex" xmlns:cx1="http://schemas.microsoft.com/office/drawing/2015/9/8/chartex" xmlns:cx2="http://schemas.microsoft.com/office/drawing/2015/10/21/chartex" xmlns:cx3="http://schemas.microsoft.com/office/drawing/2016/5/9/chartex" xmlns:cx4="http://schemas.microsoft.com/office/drawing/2016/5/10/chartex" xmlns:cx5="http://schemas.microsoft.com/office/drawing/2016/5/11/chartex" xmlns:cx6="http://schemas.microsoft.com/office/drawing/2016/5/12/chartex" xmlns:cx7="http://schemas.microsoft.com/office/drawing/2016/5/13/chartex" xmlns:cx8="http://schemas.microsoft.com/office/drawing/2016/5/14/chartex" xmlns:mc="http://schemas.openxmlformats.org/markup-compatibility/2006" xmlns:aink="http://schemas.microsoft.com/office/drawing/2016/ink" xmlns:am3d="http://schemas.microsoft.com/office/drawing/2017/model3d" xmlns:o="urn:schemas-microsoft-com:office:office" xmlns:oel="http://schemas.microsoft.com/office/2019/extlst" xmlns:r="http://schemas.openxmlformats.org/officeDocument/2006/relationships" xmlns:m="http://schemas.openxmlformats.org/officeDocument/2006/math" xmlns:v="urn:schemas-microsoft-com:vml" xmlns:wp14="http://schemas.microsoft.com/office/word/2010/wordprocessingDrawing" xmlns:wp="http://schemas.openxmlformats.org/drawingml/2006/wordprocessingDrawing" xmlns:w10="urn:schemas-microsoft-com:office:word" xmlns:w="http://schemas.openxmlformats.org/wordprocessingml/2006/main" xmlns:w14="http://schemas.microsoft.com/office/word/2010/wordml" xmlns:w15="http://schemas.microsoft.com/office/word/2012/wordml" xmlns:w16cex="http://schemas.microsoft.com/office/word/2018/wordml/cex" xmlns:w16cid="http://schemas.microsoft.com/office/word/2016/wordml/cid" xmlns:w16="http://schemas.microsoft.com/office/word/2018/wordml" xmlns:w16du="http://schemas.microsoft.com/office/word/2023/wordml/word16du" xmlns:w16sdtdh="http://schemas.microsoft.com/office/word/2020/wordml/sdtdatahash" xmlns:w16se="http://schemas.microsoft.com/office/word/2015/wordml/symex" xmlns:wpg="http://schemas.microsoft.com/office/word/2010/wordprocessingGroup" xmlns:wpi="http://schemas.microsoft.com/office/word/2010/wordprocessingInk" xmlns:wne="http://schemas.microsoft.com/office/word/2006/wordml" xmlns:wps="http://schemas.microsoft.com/office/word/2010/wordprocessingShape" mc:Ignorable="w14 w15 w16se w16cid w16 w16cex w16sdtdh w16du wp14">
   <w:endnote w:type="separator" w:id="-1">
     <w:p>
       <w:r>
@@ -2298,7 +2302,7 @@
 </file>
 
 <file path=word/footer1.xml><?xml version="1.0" encoding="utf-8"?>
-<w:ftr xmlns:wpc="http://schemas.microsoft.com/office/word/2010/wordprocessingCanvas" xmlns:cx="http://schemas.microsoft.com/office/drawing/2014/chartex" xmlns:cx1="http://schemas.microsoft.com/office/drawing/2015/9/8/chartex" xmlns:cx2="http://schemas.microsoft.com/office/drawing/2015/10/21/chartex" xmlns:cx3="http://schemas.microsoft.com/office/drawing/2016/5/9/chartex" xmlns:cx4="http://schemas.microsoft.com/office/drawing/2016/5/10/chartex" xmlns:cx5="http://schemas.microsoft.com/office/drawing/2016/5/11/chartex" xmlns:cx6="http://schemas.microsoft.com/office/drawing/2016/5/12/chartex" xmlns:cx7="http://schemas.microsoft.com/office/drawing/2016/5/13/chartex" xmlns:cx8="http://schemas.microsoft.com/office/drawing/2016/5/14/chartex" xmlns:mc="http://schemas.openxmlformats.org/markup-compatibility/2006" xmlns:aink="http://schemas.microsoft.com/office/drawing/2016/ink" xmlns:am3d="http://schemas.microsoft.com/office/drawing/2017/model3d" xmlns:o="urn:schemas-microsoft-com:office:office" xmlns:r="http://schemas.openxmlformats.org/officeDocument/2006/relationships" xmlns:m="http://schemas.openxmlformats.org/officeDocument/2006/math" xmlns:v="urn:schemas-microsoft-com:vml" xmlns:wp14="http://schemas.microsoft.com/office/word/2010/wordprocessingDrawing" xmlns:wp="http://schemas.openxmlformats.org/drawingml/2006/wordprocessingDrawing" xmlns:w10="urn:schemas-microsoft-com:office:word" xmlns:w="http://schemas.openxmlformats.org/wordprocessingml/2006/main" xmlns:w14="http://schemas.microsoft.com/office/word/2010/wordml" xmlns:w15="http://schemas.microsoft.com/office/word/2012/wordml" xmlns:w16cid="http://schemas.microsoft.com/office/word/2016/wordml/cid" xmlns:w16se="http://schemas.microsoft.com/office/word/2015/wordml/symex" xmlns:wpg="http://schemas.microsoft.com/office/word/2010/wordprocessingGroup" xmlns:wpi="http://schemas.microsoft.com/office/word/2010/wordprocessingInk" xmlns:wne="http://schemas.microsoft.com/office/word/2006/wordml" xmlns:wps="http://schemas.microsoft.com/office/word/2010/wordprocessingShape" mc:Ignorable="w14 w15 w16se w16cid wp14">
+<w:ftr xmlns:wpc="http://schemas.microsoft.com/office/word/2010/wordprocessingCanvas" xmlns:cx="http://schemas.microsoft.com/office/drawing/2014/chartex" xmlns:cx1="http://schemas.microsoft.com/office/drawing/2015/9/8/chartex" xmlns:cx2="http://schemas.microsoft.com/office/drawing/2015/10/21/chartex" xmlns:cx3="http://schemas.microsoft.com/office/drawing/2016/5/9/chartex" xmlns:cx4="http://schemas.microsoft.com/office/drawing/2016/5/10/chartex" xmlns:cx5="http://schemas.microsoft.com/office/drawing/2016/5/11/chartex" xmlns:cx6="http://schemas.microsoft.com/office/drawing/2016/5/12/chartex" xmlns:cx7="http://schemas.microsoft.com/office/drawing/2016/5/13/chartex" xmlns:cx8="http://schemas.microsoft.com/office/drawing/2016/5/14/chartex" xmlns:mc="http://schemas.openxmlformats.org/markup-compatibility/2006" xmlns:aink="http://schemas.microsoft.com/office/drawing/2016/ink" xmlns:am3d="http://schemas.microsoft.com/office/drawing/2017/model3d" xmlns:o="urn:schemas-microsoft-com:office:office" xmlns:oel="http://schemas.microsoft.com/office/2019/extlst" xmlns:r="http://schemas.openxmlformats.org/officeDocument/2006/relationships" xmlns:m="http://schemas.openxmlformats.org/officeDocument/2006/math" xmlns:v="urn:schemas-microsoft-com:vml" xmlns:wp14="http://schemas.microsoft.com/office/word/2010/wordprocessingDrawing" xmlns:wp="http://schemas.openxmlformats.org/drawingml/2006/wordprocessingDrawing" xmlns:w10="urn:schemas-microsoft-com:office:word" xmlns:w="http://schemas.openxmlformats.org/wordprocessingml/2006/main" xmlns:w14="http://schemas.microsoft.com/office/word/2010/wordml" xmlns:w15="http://schemas.microsoft.com/office/word/2012/wordml" xmlns:w16cex="http://schemas.microsoft.com/office/word/2018/wordml/cex" xmlns:w16cid="http://schemas.microsoft.com/office/word/2016/wordml/cid" xmlns:w16="http://schemas.microsoft.com/office/word/2018/wordml" xmlns:w16du="http://schemas.microsoft.com/office/word/2023/wordml/word16du" xmlns:w16sdtdh="http://schemas.microsoft.com/office/word/2020/wordml/sdtdatahash" xmlns:w16se="http://schemas.microsoft.com/office/word/2015/wordml/symex" xmlns:wpg="http://schemas.microsoft.com/office/word/2010/wordprocessingGroup" xmlns:wpi="http://schemas.microsoft.com/office/word/2010/wordprocessingInk" xmlns:wne="http://schemas.microsoft.com/office/word/2006/wordml" xmlns:wps="http://schemas.microsoft.com/office/word/2010/wordprocessingShape" mc:Ignorable="w14 w15 w16se w16cid w16 w16cex w16sdtdh w16du wp14">
   <w:p>
     <w:pPr>
       <w:tabs>
@@ -2489,7 +2493,7 @@
 </file>
 
 <file path=word/footnotes.xml><?xml version="1.0" encoding="utf-8"?>
-<w:footnotes xmlns:wpc="http://schemas.microsoft.com/office/word/2010/wordprocessingCanvas" xmlns:cx="http://schemas.microsoft.com/office/drawing/2014/chartex" xmlns:cx1="http://schemas.microsoft.com/office/drawing/2015/9/8/chartex" xmlns:cx2="http://schemas.microsoft.com/office/drawing/2015/10/21/chartex" xmlns:cx3="http://schemas.microsoft.com/office/drawing/2016/5/9/chartex" xmlns:cx4="http://schemas.microsoft.com/office/drawing/2016/5/10/chartex" xmlns:cx5="http://schemas.microsoft.com/office/drawing/2016/5/11/chartex" xmlns:cx6="http://schemas.microsoft.com/office/drawing/2016/5/12/chartex" xmlns:cx7="http://schemas.microsoft.com/office/drawing/2016/5/13/chartex" xmlns:cx8="http://schemas.microsoft.com/office/drawing/2016/5/14/chartex" xmlns:mc="http://schemas.openxmlformats.org/markup-compatibility/2006" xmlns:aink="http://schemas.microsoft.com/office/drawing/2016/ink" xmlns:am3d="http://schemas.microsoft.com/office/drawing/2017/model3d" xmlns:o="urn:schemas-microsoft-com:office:office" xmlns:r="http://schemas.openxmlformats.org/officeDocument/2006/relationships" xmlns:m="http://schemas.openxmlformats.org/officeDocument/2006/math" xmlns:v="urn:schemas-microsoft-com:vml" xmlns:wp14="http://schemas.microsoft.com/office/word/2010/wordprocessingDrawing" xmlns:wp="http://schemas.openxmlformats.org/drawingml/2006/wordprocessingDrawing" xmlns:w10="urn:schemas-microsoft-com:office:word" xmlns:w="http://schemas.openxmlformats.org/wordprocessingml/2006/main" xmlns:w14="http://schemas.microsoft.com/office/word/2010/wordml" xmlns:w15="http://schemas.microsoft.com/office/word/2012/wordml" xmlns:w16cid="http://schemas.microsoft.com/office/word/2016/wordml/cid" xmlns:w16se="http://schemas.microsoft.com/office/word/2015/wordml/symex" xmlns:wpg="http://schemas.microsoft.com/office/word/2010/wordprocessingGroup" xmlns:wpi="http://schemas.microsoft.com/office/word/2010/wordprocessingInk" xmlns:wne="http://schemas.microsoft.com/office/word/2006/wordml" xmlns:wps="http://schemas.microsoft.com/office/word/2010/wordprocessingShape" mc:Ignorable="w14 w15 w16se w16cid wp14">
+<w:footnotes xmlns:wpc="http://schemas.microsoft.com/office/word/2010/wordprocessingCanvas" xmlns:cx="http://schemas.microsoft.com/office/drawing/2014/chartex" xmlns:cx1="http://schemas.microsoft.com/office/drawing/2015/9/8/chartex" xmlns:cx2="http://schemas.microsoft.com/office/drawing/2015/10/21/chartex" xmlns:cx3="http://schemas.microsoft.com/office/drawing/2016/5/9/chartex" xmlns:cx4="http://schemas.microsoft.com/office/drawing/2016/5/10/chartex" xmlns:cx5="http://schemas.microsoft.com/office/drawing/2016/5/11/chartex" xmlns:cx6="http://schemas.microsoft.com/office/drawing/2016/5/12/chartex" xmlns:cx7="http://schemas.microsoft.com/office/drawing/2016/5/13/chartex" xmlns:cx8="http://schemas.microsoft.com/office/drawing/2016/5/14/chartex" xmlns:mc="http://schemas.openxmlformats.org/markup-compatibility/2006" xmlns:aink="http://schemas.microsoft.com/office/drawing/2016/ink" xmlns:am3d="http://schemas.microsoft.com/office/drawing/2017/model3d" xmlns:o="urn:schemas-microsoft-com:office:office" xmlns:oel="http://schemas.microsoft.com/office/2019/extlst" xmlns:r="http://schemas.openxmlformats.org/officeDocument/2006/relationships" xmlns:m="http://schemas.openxmlformats.org/officeDocument/2006/math" xmlns:v="urn:schemas-microsoft-com:vml" xmlns:wp14="http://schemas.microsoft.com/office/word/2010/wordprocessingDrawing" xmlns:wp="http://schemas.openxmlformats.org/drawingml/2006/wordprocessingDrawing" xmlns:w10="urn:schemas-microsoft-com:office:word" xmlns:w="http://schemas.openxmlformats.org/wordprocessingml/2006/main" xmlns:w14="http://schemas.microsoft.com/office/word/2010/wordml" xmlns:w15="http://schemas.microsoft.com/office/word/2012/wordml" xmlns:w16cex="http://schemas.microsoft.com/office/word/2018/wordml/cex" xmlns:w16cid="http://schemas.microsoft.com/office/word/2016/wordml/cid" xmlns:w16="http://schemas.microsoft.com/office/word/2018/wordml" xmlns:w16du="http://schemas.microsoft.com/office/word/2023/wordml/word16du" xmlns:w16sdtdh="http://schemas.microsoft.com/office/word/2020/wordml/sdtdatahash" xmlns:w16se="http://schemas.microsoft.com/office/word/2015/wordml/symex" xmlns:wpg="http://schemas.microsoft.com/office/word/2010/wordprocessingGroup" xmlns:wpi="http://schemas.microsoft.com/office/word/2010/wordprocessingInk" xmlns:wne="http://schemas.microsoft.com/office/word/2006/wordml" xmlns:wps="http://schemas.microsoft.com/office/word/2010/wordprocessingShape" mc:Ignorable="w14 w15 w16se w16cid w16 w16cex w16sdtdh w16du wp14">
   <w:footnote w:type="separator" w:id="-1">
     <w:p>
       <w:r>
@@ -2508,7 +2512,7 @@
 </file>
 
 <file path=word/header1.xml><?xml version="1.0" encoding="utf-8"?>
-<w:hdr xmlns:wpc="http://schemas.microsoft.com/office/word/2010/wordprocessingCanvas" xmlns:cx="http://schemas.microsoft.com/office/drawing/2014/chartex" xmlns:cx1="http://schemas.microsoft.com/office/drawing/2015/9/8/chartex" xmlns:cx2="http://schemas.microsoft.com/office/drawing/2015/10/21/chartex" xmlns:cx3="http://schemas.microsoft.com/office/drawing/2016/5/9/chartex" xmlns:cx4="http://schemas.microsoft.com/office/drawing/2016/5/10/chartex" xmlns:cx5="http://schemas.microsoft.com/office/drawing/2016/5/11/chartex" xmlns:cx6="http://schemas.microsoft.com/office/drawing/2016/5/12/chartex" xmlns:cx7="http://schemas.microsoft.com/office/drawing/2016/5/13/chartex" xmlns:cx8="http://schemas.microsoft.com/office/drawing/2016/5/14/chartex" xmlns:mc="http://schemas.openxmlformats.org/markup-compatibility/2006" xmlns:aink="http://schemas.microsoft.com/office/drawing/2016/ink" xmlns:am3d="http://schemas.microsoft.com/office/drawing/2017/model3d" xmlns:o="urn:schemas-microsoft-com:office:office" xmlns:r="http://schemas.openxmlformats.org/officeDocument/2006/relationships" xmlns:m="http://schemas.openxmlformats.org/officeDocument/2006/math" xmlns:v="urn:schemas-microsoft-com:vml" xmlns:wp14="http://schemas.microsoft.com/office/word/2010/wordprocessingDrawing" xmlns:wp="http://schemas.openxmlformats.org/drawingml/2006/wordprocessingDrawing" xmlns:w10="urn:schemas-microsoft-com:office:word" xmlns:w="http://schemas.openxmlformats.org/wordprocessingml/2006/main" xmlns:w14="http://schemas.microsoft.com/office/word/2010/wordml" xmlns:w15="http://schemas.microsoft.com/office/word/2012/wordml" xmlns:w16cid="http://schemas.microsoft.com/office/word/2016/wordml/cid" xmlns:w16se="http://schemas.microsoft.com/office/word/2015/wordml/symex" xmlns:wpg="http://schemas.microsoft.com/office/word/2010/wordprocessingGroup" xmlns:wpi="http://schemas.microsoft.com/office/word/2010/wordprocessingInk" xmlns:wne="http://schemas.microsoft.com/office/word/2006/wordml" xmlns:wps="http://schemas.microsoft.com/office/word/2010/wordprocessingShape" mc:Ignorable="w14 w15 w16se w16cid wp14">
+<w:hdr xmlns:wpc="http://schemas.microsoft.com/office/word/2010/wordprocessingCanvas" xmlns:cx="http://schemas.microsoft.com/office/drawing/2014/chartex" xmlns:cx1="http://schemas.microsoft.com/office/drawing/2015/9/8/chartex" xmlns:cx2="http://schemas.microsoft.com/office/drawing/2015/10/21/chartex" xmlns:cx3="http://schemas.microsoft.com/office/drawing/2016/5/9/chartex" xmlns:cx4="http://schemas.microsoft.com/office/drawing/2016/5/10/chartex" xmlns:cx5="http://schemas.microsoft.com/office/drawing/2016/5/11/chartex" xmlns:cx6="http://schemas.microsoft.com/office/drawing/2016/5/12/chartex" xmlns:cx7="http://schemas.microsoft.com/office/drawing/2016/5/13/chartex" xmlns:cx8="http://schemas.microsoft.com/office/drawing/2016/5/14/chartex" xmlns:mc="http://schemas.openxmlformats.org/markup-compatibility/2006" xmlns:aink="http://schemas.microsoft.com/office/drawing/2016/ink" xmlns:am3d="http://schemas.microsoft.com/office/drawing/2017/model3d" xmlns:o="urn:schemas-microsoft-com:office:office" xmlns:oel="http://schemas.microsoft.com/office/2019/extlst" xmlns:r="http://schemas.openxmlformats.org/officeDocument/2006/relationships" xmlns:m="http://schemas.openxmlformats.org/officeDocument/2006/math" xmlns:v="urn:schemas-microsoft-com:vml" xmlns:wp14="http://schemas.microsoft.com/office/word/2010/wordprocessingDrawing" xmlns:wp="http://schemas.openxmlformats.org/drawingml/2006/wordprocessingDrawing" xmlns:w10="urn:schemas-microsoft-com:office:word" xmlns:w="http://schemas.openxmlformats.org/wordprocessingml/2006/main" xmlns:w14="http://schemas.microsoft.com/office/word/2010/wordml" xmlns:w15="http://schemas.microsoft.com/office/word/2012/wordml" xmlns:w16cex="http://schemas.microsoft.com/office/word/2018/wordml/cex" xmlns:w16cid="http://schemas.microsoft.com/office/word/2016/wordml/cid" xmlns:w16="http://schemas.microsoft.com/office/word/2018/wordml" xmlns:w16du="http://schemas.microsoft.com/office/word/2023/wordml/word16du" xmlns:w16sdtdh="http://schemas.microsoft.com/office/word/2020/wordml/sdtdatahash" xmlns:w16se="http://schemas.microsoft.com/office/word/2015/wordml/symex" xmlns:wpg="http://schemas.microsoft.com/office/word/2010/wordprocessingGroup" xmlns:wpi="http://schemas.microsoft.com/office/word/2010/wordprocessingInk" xmlns:wne="http://schemas.microsoft.com/office/word/2006/wordml" xmlns:wps="http://schemas.microsoft.com/office/word/2010/wordprocessingShape" mc:Ignorable="w14 w15 w16se w16cid w16 w16cex w16sdtdh w16du wp14">
   <w:p>
     <w:pPr>
       <w:pStyle w:val="Title"/>
@@ -2550,7 +2554,7 @@
 </file>
 
 <file path=word/styles.xml><?xml version="1.0" encoding="utf-8"?>
-<w:styles xmlns:mc="http://schemas.openxmlformats.org/markup-compatibility/2006" xmlns:r="http://schemas.openxmlformats.org/officeDocument/2006/relationships" xmlns:w="http://schemas.openxmlformats.org/wordprocessingml/2006/main" xmlns:w14="http://schemas.microsoft.com/office/word/2010/wordml" xmlns:w15="http://schemas.microsoft.com/office/word/2012/wordml" xmlns:w16cid="http://schemas.microsoft.com/office/word/2016/wordml/cid" xmlns:w16se="http://schemas.microsoft.com/office/word/2015/wordml/symex" mc:Ignorable="w14 w15 w16se w16cid">
+<w:styles xmlns:mc="http://schemas.openxmlformats.org/markup-compatibility/2006" xmlns:r="http://schemas.openxmlformats.org/officeDocument/2006/relationships" xmlns:w="http://schemas.openxmlformats.org/wordprocessingml/2006/main" xmlns:w14="http://schemas.microsoft.com/office/word/2010/wordml" xmlns:w15="http://schemas.microsoft.com/office/word/2012/wordml" xmlns:w16cex="http://schemas.microsoft.com/office/word/2018/wordml/cex" xmlns:w16cid="http://schemas.microsoft.com/office/word/2016/wordml/cid" xmlns:w16="http://schemas.microsoft.com/office/word/2018/wordml" xmlns:w16du="http://schemas.microsoft.com/office/word/2023/wordml/word16du" xmlns:w16sdtdh="http://schemas.microsoft.com/office/word/2020/wordml/sdtdatahash" xmlns:w16se="http://schemas.microsoft.com/office/word/2015/wordml/symex" mc:Ignorable="w14 w15 w16se w16cid w16 w16cex w16sdtdh w16du">
   <w:docDefaults>
     <w:rPrDefault>
       <w:rPr>
@@ -2568,7 +2572,7 @@
       </w:pPr>
     </w:pPrDefault>
   </w:docDefaults>
-  <w:latentStyles w:defLockedState="0" w:defUIPriority="99" w:defSemiHidden="0" w:defUnhideWhenUsed="0" w:defQFormat="0" w:count="375">
+  <w:latentStyles w:defLockedState="0" w:defUIPriority="99" w:defSemiHidden="0" w:defUnhideWhenUsed="0" w:defQFormat="0" w:count="376">
     <w:lsdException w:name="Normal" w:uiPriority="0" w:qFormat="1"/>
     <w:lsdException w:name="heading 1" w:uiPriority="9" w:qFormat="1"/>
     <w:lsdException w:name="heading 2" w:semiHidden="1" w:uiPriority="9" w:unhideWhenUsed="1" w:qFormat="1"/>
@@ -2944,6 +2948,7 @@
     <w:lsdException w:name="Smart Hyperlink" w:semiHidden="1" w:unhideWhenUsed="1"/>
     <w:lsdException w:name="Hashtag" w:semiHidden="1" w:unhideWhenUsed="1"/>
     <w:lsdException w:name="Unresolved Mention" w:semiHidden="1" w:unhideWhenUsed="1"/>
+    <w:lsdException w:name="Smart Link" w:semiHidden="1" w:unhideWhenUsed="1"/>
   </w:latentStyles>
   <w:style w:type="paragraph" w:default="1" w:styleId="Normal">
     <w:name w:val="Normal"/>
@@ -2955,7 +2960,6 @@
   <w:style w:type="character" w:default="1" w:styleId="DefaultParagraphFont">
     <w:name w:val="Default Paragraph Font"/>
     <w:uiPriority w:val="1"/>
-    <w:semiHidden/>
     <w:unhideWhenUsed/>
   </w:style>
   <w:style w:type="table" w:default="1" w:styleId="TableNormal">

</xml_diff>